<commit_message>
Revise CV content and structure; update skills categorization and add new publications with links. Enhance CV generation script to reflect changes in skills and publications.
</commit_message>
<xml_diff>
--- a/public/sahej-cv-ats.docx
+++ b/public/sahej-cv-ats.docx
@@ -315,23 +315,15 @@
         <w:spacing w:after="40"/>
       </w:pPr>
       <w:r>
-        <w:t xml:space="preserve">AI/Backend: Google ADK, RAG, MCP, n8n, Python, FastAPI, Node.js, NestJS, multi-agent systems</w:t>
-      </w:r>
-    </w:p>
-    <w:p>
-      <w:pPr>
-        <w:spacing w:after="40"/>
-      </w:pPr>
-      <w:r>
-        <w:t xml:space="preserve">Frontend: JavaScript, TypeScript, React, React Native, Next.js, Electron, Tailwind CSS, Redux, React Query</w:t>
-      </w:r>
-    </w:p>
-    <w:p>
-      <w:pPr>
-        <w:spacing w:after="40"/>
-      </w:pPr>
-      <w:r>
-        <w:t xml:space="preserve">Data/DevOps: Supabase, PostgreSQL, MongoDB, dbt, Docker, Serverless Framework</w:t>
+        <w:t xml:space="preserve">Core (could teach it): TypeScript, Next.js/React, React Native, Electron</w:t>
+      </w:r>
+    </w:p>
+    <w:p>
+      <w:pPr>
+        <w:spacing w:after="40"/>
+      </w:pPr>
+      <w:r>
+        <w:t xml:space="preserve">Proficient (used in production): Google ADK, FastAPI, n8n, AWS Lambda, ECS, S3, DynamoDB, GCP Cloud Run, BigQuery, Supabase, MCP tools, Docker, Postgres, Node.js/NestJS, Cognito, Route 53, Secrets Manager, SQS, SNS, EventBridge, AppSync, Amplify, CloudWatch, IAM, MongoDB</w:t>
       </w:r>
     </w:p>
     <w:p>
@@ -339,7 +331,7 @@
         <w:spacing w:after="80"/>
       </w:pPr>
       <w:r>
-        <w:t xml:space="preserve">Cloud: GCP (Cloud Run, BigQuery, Firestore), AWS (Lambda, ECS, S3, DynamoDB, Cognito, AppSync, Amplify, CloudFront)</w:t>
+        <w:t xml:space="preserve">Familiar (learning or light use): Sentry, LaunchDarkly, Terraform</w:t>
       </w:r>
     </w:p>
     <w:p>
@@ -356,7 +348,15 @@
         <w:spacing w:after="40"/>
       </w:pPr>
       <w:r>
-        <w:t xml:space="preserve">Rebuilding our Access Control for AI Agents - DVx Blog, Jun 2026 (co-authored with Amit Maraj)</w:t>
+        <w:t xml:space="preserve">We stopped treating agent latency as one number - DVx Blog, Jul 2026 (co-authored with Amit Maraj) - blog.dvx.ventures/we-stopped-treating-agent-latency-as-one-number</w:t>
+      </w:r>
+    </w:p>
+    <w:p>
+      <w:pPr>
+        <w:spacing w:after="40"/>
+      </w:pPr>
+      <w:r>
+        <w:t xml:space="preserve">The agent doesn't hold the data. It decides where to go get it. - DVx Blog, Jun 2026 (co-authored with Amit Maraj) - blog.dvx.ventures/the-agent-doesnt-hold-the-data</w:t>
       </w:r>
     </w:p>
     <w:p>
@@ -365,6 +365,14 @@
       </w:pPr>
       <w:r>
         <w:t xml:space="preserve">Automating Gap-Night Revenue and Pool Heater Ops with n8n - Personal blog, Jun 2026</w:t>
+      </w:r>
+    </w:p>
+    <w:p>
+      <w:pPr>
+        <w:spacing w:after="40"/>
+      </w:pPr>
+      <w:r>
+        <w:t xml:space="preserve">Rebuilding our Access Control for AI Agents - DVx Blog, Jun 2026 (co-authored with Amit Maraj) - blog.dvx.ventures/access-control-for-ai-agents</w:t>
       </w:r>
     </w:p>
     <w:p>

</xml_diff>

<commit_message>
Update CV files with new contact number and correct employment dates for Tactix AI; reflect changes in HTML, DOCX, and portfolio data.
</commit_message>
<xml_diff>
--- a/public/sahej-cv-ats.docx
+++ b/public/sahej-cv-ats.docx
@@ -30,7 +30,7 @@
         <w:spacing w:after="80"/>
       </w:pPr>
       <w:r>
-        <w:t xml:space="preserve">Dublin, Ireland | sahejmaharjan@gmail.com | sahejmaharjan.com.np | linkedin.com/in/sahej-maharjan-433a34105 | github.com/Sahejmaharjan1 | stackoverflow.com/users/13797926/sahej-maharjan</w:t>
+        <w:t xml:space="preserve">Dublin, Ireland | +3530899490837 | sahejmaharjan@gmail.com | sahejmaharjan.com.np | linkedin.com/in/sahej-maharjan-433a34105 | github.com/Sahejmaharjan1 | stackoverflow.com/users/13797926/sahej-maharjan</w:t>
       </w:r>
     </w:p>
     <w:p>
@@ -71,7 +71,7 @@
         <w:t xml:space="preserve">AI Engineer</w:t>
       </w:r>
       <w:r>
-        <w:t xml:space="preserve"> | Tactix AI (via DVx Ventures) | Remote | Jan 2025 - Present</w:t>
+        <w:t xml:space="preserve"> | Tactix AI (via DVx Ventures) | Remote | Jan 2026 - Present</w:t>
       </w:r>
     </w:p>
     <w:p>

</xml_diff>

<commit_message>
Enhance CV content and structure; update contact information, summary, work experience details, and education section. Add new Education component to the application and improve CV generation script to reflect these changes.
</commit_message>
<xml_diff>
--- a/public/sahej-cv-ats.docx
+++ b/public/sahej-cv-ats.docx
@@ -30,7 +30,7 @@
         <w:spacing w:after="80"/>
       </w:pPr>
       <w:r>
-        <w:t xml:space="preserve">Dublin, Ireland | +3530899490837 | sahejmaharjan@gmail.com | sahejmaharjan.com.np | linkedin.com/in/sahej-maharjan-433a34105 | github.com/Sahejmaharjan1 | stackoverflow.com/users/13797926/sahej-maharjan</w:t>
+        <w:t xml:space="preserve">Dublin, Ireland | +353 89 949 0837 | sahejmaharjan@gmail.com | sahejmaharjan.com.np | linkedin.com/in/sahej-maharjan-433a34105 | github.com/Sahejmaharjan1 | stackoverflow.com/users/13797926/sahej-maharjan</w:t>
       </w:r>
     </w:p>
     <w:p>
@@ -47,7 +47,7 @@
         <w:spacing w:after="40"/>
       </w:pPr>
       <w:r>
-        <w:t xml:space="preserve">AI engineer building multi-agent systems and RAG pipelines on GCP at Tactix AI. 5+ years across frontend leadership, full-stack delivery, and production AI. Co-author on DVx engineering blog, merged OSS contributor, Indigo Product Hunt #2 (maker).</w:t>
+        <w:t xml:space="preserve">Full-stack engineer with 5+ years shipping production React/Next.js and TypeScript front ends and Node.js/AWS back ends. Led front-end architecture and production releases through one company acquisition, and now builds multi-agent AI systems and RAG pipelines on GCP. Shipped a #2 Product Hunt launch as a maker and merged contributions into an open-source codebase. Holds an MSc in Big Data Management and Analytics (First Class Honours). Co-author of 3 engineering posts on the DVx Ventures blog.</w:t>
       </w:r>
     </w:p>
     <w:p>
@@ -84,33 +84,33 @@
         <w:spacing w:after="20"/>
       </w:pPr>
       <w:r>
-        <w:t xml:space="preserve">Building multi-agent AI platform on GCP Cloud Run with Google ADK; RAG pipelines over BigQuery with dbt models.</w:t>
-      </w:r>
-    </w:p>
-    <w:p>
-      <w:pPr>
-        <w:pStyle w:val="ListParagraph"/>
-        <w:numPr>
-          <w:ilvl w:val="0"/>
-          <w:numId w:val="1"/>
-        </w:numPr>
-        <w:spacing w:after="20"/>
-      </w:pPr>
-      <w:r>
-        <w:t xml:space="preserve">Designing access control scoping every agent call to authenticated user permissions.</w:t>
-      </w:r>
-    </w:p>
-    <w:p>
-      <w:pPr>
-        <w:pStyle w:val="ListParagraph"/>
-        <w:numPr>
-          <w:ilvl w:val="0"/>
-          <w:numId w:val="1"/>
-        </w:numPr>
-        <w:spacing w:after="20"/>
-      </w:pPr>
-      <w:r>
-        <w:t xml:space="preserve">Co-authoring public engineering blog series on Tactix systems.</w:t>
+        <w:t xml:space="preserve">Building a multi-agent AI platform for restaurant operators, deploying containerised agents to GCP Cloud Run with Google ADK as the orchestration layer.</w:t>
+      </w:r>
+    </w:p>
+    <w:p>
+      <w:pPr>
+        <w:pStyle w:val="ListParagraph"/>
+        <w:numPr>
+          <w:ilvl w:val="0"/>
+          <w:numId w:val="1"/>
+        </w:numPr>
+        <w:spacing w:after="20"/>
+      </w:pPr>
+      <w:r>
+        <w:t xml:space="preserve">Architecting RAG pipelines over BigQuery on dbt-transformed data models that feed agent tool calls.</w:t>
+      </w:r>
+    </w:p>
+    <w:p>
+      <w:pPr>
+        <w:pStyle w:val="ListParagraph"/>
+        <w:numPr>
+          <w:ilvl w:val="0"/>
+          <w:numId w:val="1"/>
+        </w:numPr>
+        <w:spacing w:after="20"/>
+      </w:pPr>
+      <w:r>
+        <w:t xml:space="preserve">Designed a hybrid RBAC/ACL authorization system enforced through a single Postgres auth function, scoping every agent call to the authenticated user's permissions.</w:t>
       </w:r>
     </w:p>
     <w:p>
@@ -127,7 +127,7 @@
           <w:b/>
           <w:bCs/>
         </w:rPr>
-        <w:t xml:space="preserve">Lead Frontend Engineer / Full Stack Engineer</w:t>
+        <w:t xml:space="preserve">Lead Front-End / Full-Stack Engineer</w:t>
       </w:r>
       <w:r>
         <w:t xml:space="preserve"> | Indigo AI | Remote | Oct 2024 - Sep 2025</w:t>
@@ -143,20 +143,33 @@
         <w:spacing w:after="20"/>
       </w:pPr>
       <w:r>
-        <w:t xml:space="preserve">Continued as lead after Shopswap acquisition; owned React/Next.js architecture and production releases.</w:t>
-      </w:r>
-    </w:p>
-    <w:p>
-      <w:pPr>
-        <w:pStyle w:val="ListParagraph"/>
-        <w:numPr>
-          <w:ilvl w:val="0"/>
-          <w:numId w:val="1"/>
-        </w:numPr>
-        <w:spacing w:after="20"/>
-      </w:pPr>
-      <w:r>
-        <w:t xml:space="preserve">Maker on Indigo Product Hunt launch, ranked #2 Product of the Day.</w:t>
+        <w:t xml:space="preserve">Continued as lead front-end engineer after Shopswap's acquisition by Indigo AI; owned architecture decisions, full-stack feature delivery, and production releases for live React/Next.js applications.</w:t>
+      </w:r>
+    </w:p>
+    <w:p>
+      <w:pPr>
+        <w:pStyle w:val="ListParagraph"/>
+        <w:numPr>
+          <w:ilvl w:val="0"/>
+          <w:numId w:val="1"/>
+        </w:numPr>
+        <w:spacing w:after="20"/>
+      </w:pPr>
+      <w:r>
+        <w:t xml:space="preserve">Shipped Indigo as a maker on Product Hunt, reaching #2 Product of the Day on launch day.</w:t>
+      </w:r>
+    </w:p>
+    <w:p>
+      <w:pPr>
+        <w:pStyle w:val="ListParagraph"/>
+        <w:numPr>
+          <w:ilvl w:val="0"/>
+          <w:numId w:val="1"/>
+        </w:numPr>
+        <w:spacing w:after="20"/>
+      </w:pPr>
+      <w:r>
+        <w:t xml:space="preserve">Partnered with design and backend engineers to scope, unblock, and ship cross-functional features end to end.</w:t>
       </w:r>
     </w:p>
     <w:p>
@@ -173,7 +186,7 @@
           <w:b/>
           <w:bCs/>
         </w:rPr>
-        <w:t xml:space="preserve">Lead Frontend Engineer / Full Stack Engineer</w:t>
+        <w:t xml:space="preserve">Lead Front-End / Full-Stack Engineer</w:t>
       </w:r>
       <w:r>
         <w:t xml:space="preserve"> | Shopswap | Remote | Aug 2022 - Oct 2024</w:t>
@@ -189,20 +202,20 @@
         <w:spacing w:after="20"/>
       </w:pPr>
       <w:r>
-        <w:t xml:space="preserve">Led frontend for brand partnership toolkit; owned architecture, coding standards, and production delivery.</w:t>
-      </w:r>
-    </w:p>
-    <w:p>
-      <w:pPr>
-        <w:pStyle w:val="ListParagraph"/>
-        <w:numPr>
-          <w:ilvl w:val="0"/>
-          <w:numId w:val="1"/>
-        </w:numPr>
-        <w:spacing w:after="20"/>
-      </w:pPr>
-      <w:r>
-        <w:t xml:space="preserve">Full-stack feature delivery on React/Next.js until acquisition by Indigo AI.</w:t>
+        <w:t xml:space="preserve">Led front-end engineering for a brand-partnership, giveaway, and discount-sharing toolkit; set frontend architecture and coding standards.</w:t>
+      </w:r>
+    </w:p>
+    <w:p>
+      <w:pPr>
+        <w:pStyle w:val="ListParagraph"/>
+        <w:numPr>
+          <w:ilvl w:val="0"/>
+          <w:numId w:val="1"/>
+        </w:numPr>
+        <w:spacing w:after="20"/>
+      </w:pPr>
+      <w:r>
+        <w:t xml:space="preserve">Delivered production features across React and Next.js applications through to acquisition by Indigo AI.</w:t>
       </w:r>
     </w:p>
     <w:p>
@@ -219,23 +232,36 @@
           <w:b/>
           <w:bCs/>
         </w:rPr>
-        <w:t xml:space="preserve">Full Stack Engineer / Frontend Team Lead</w:t>
-      </w:r>
-      <w:r>
-        <w:t xml:space="preserve"> | Preparie Inc. | Remote | Sep 2021 - Aug 2022</w:t>
-      </w:r>
-    </w:p>
-    <w:p>
-      <w:pPr>
-        <w:pStyle w:val="ListParagraph"/>
-        <w:numPr>
-          <w:ilvl w:val="0"/>
-          <w:numId w:val="1"/>
-        </w:numPr>
-        <w:spacing w:after="20"/>
-      </w:pPr>
-      <w:r>
-        <w:t xml:space="preserve">Led frontend team operations, scheduling, documentation, and delivery across the Preparie platform.</w:t>
+        <w:t xml:space="preserve">Full-Stack Engineer</w:t>
+      </w:r>
+      <w:r>
+        <w:t xml:space="preserve"> | Preparie Inc. | Canada, Remote | Sep 2021 - Aug 2022</w:t>
+      </w:r>
+    </w:p>
+    <w:p>
+      <w:pPr>
+        <w:pStyle w:val="ListParagraph"/>
+        <w:numPr>
+          <w:ilvl w:val="0"/>
+          <w:numId w:val="1"/>
+        </w:numPr>
+        <w:spacing w:after="20"/>
+      </w:pPr>
+      <w:r>
+        <w:t xml:space="preserve">Built full-stack features across the Preparie platform using React, Next.js, and Node.js.</w:t>
+      </w:r>
+    </w:p>
+    <w:p>
+      <w:pPr>
+        <w:pStyle w:val="ListParagraph"/>
+        <w:numPr>
+          <w:ilvl w:val="0"/>
+          <w:numId w:val="1"/>
+        </w:numPr>
+        <w:spacing w:after="20"/>
+      </w:pPr>
+      <w:r>
+        <w:t xml:space="preserve">Served as front-end team lead, managing scheduling, coverage, documentation, and delivery.</w:t>
       </w:r>
     </w:p>
     <w:p>
@@ -252,23 +278,23 @@
           <w:b/>
           <w:bCs/>
         </w:rPr>
-        <w:t xml:space="preserve">React / React Native / Next.js Developer</w:t>
-      </w:r>
-      <w:r>
-        <w:t xml:space="preserve"> | Bottle Technology | Nepal | Sep 2020 - Dec 2021</w:t>
-      </w:r>
-    </w:p>
-    <w:p>
-      <w:pPr>
-        <w:pStyle w:val="ListParagraph"/>
-        <w:numPr>
-          <w:ilvl w:val="0"/>
-          <w:numId w:val="1"/>
-        </w:numPr>
-        <w:spacing w:after="20"/>
-      </w:pPr>
-      <w:r>
-        <w:t xml:space="preserve">Frontend and mobile development; wrote 200+ JavaScript components; mentored a new frontend developer.</w:t>
+        <w:t xml:space="preserve">Frontend and Mobile Software Engineer</w:t>
+      </w:r>
+      <w:r>
+        <w:t xml:space="preserve"> | Bottle Technology | Jhamsikhel, Nepal | Sep 2020 - Dec 2021</w:t>
+      </w:r>
+    </w:p>
+    <w:p>
+      <w:pPr>
+        <w:pStyle w:val="ListParagraph"/>
+        <w:numPr>
+          <w:ilvl w:val="0"/>
+          <w:numId w:val="1"/>
+        </w:numPr>
+        <w:spacing w:after="20"/>
+      </w:pPr>
+      <w:r>
+        <w:t xml:space="preserve">Built 200+ JavaScript components for client web and mobile projects; onboarded and mentored a junior front-end developer.</w:t>
       </w:r>
     </w:p>
     <w:p>
@@ -290,7 +316,7 @@
         <w:spacing w:after="40"/>
       </w:pPr>
       <w:r>
-        <w:t xml:space="preserve">Griffith College Dublin - MSc Big Data Management and Analytics | Sep 2025 - 2026</w:t>
+        <w:t xml:space="preserve">Griffith College Dublin - MSc, Big Data Management and Analytics, First Class Honours | Dublin, Ireland | 2025 - 2026</w:t>
       </w:r>
     </w:p>
     <w:p>
@@ -298,7 +324,7 @@
         <w:spacing w:after="80"/>
       </w:pPr>
       <w:r>
-        <w:t xml:space="preserve">Deerwalk Institute of Technology - BSc Computer Science and Technology | 2017 - 2021</w:t>
+        <w:t xml:space="preserve">Deerwalk Institute of Technology - BSc, Computer Science and Technology | Kathmandu, Nepal | 2017 - 2021</w:t>
       </w:r>
     </w:p>
     <w:p>
@@ -315,15 +341,39 @@
         <w:spacing w:after="40"/>
       </w:pPr>
       <w:r>
-        <w:t xml:space="preserve">Core (could teach it): TypeScript, Next.js/React, React Native, Electron</w:t>
-      </w:r>
-    </w:p>
-    <w:p>
-      <w:pPr>
-        <w:spacing w:after="40"/>
-      </w:pPr>
-      <w:r>
-        <w:t xml:space="preserve">Proficient (used in production): Google ADK, FastAPI, n8n, AWS Lambda, ECS, S3, DynamoDB, GCP Cloud Run, BigQuery, Supabase, MCP tools, Docker, Postgres, Node.js/NestJS, Cognito, Route 53, Secrets Manager, SQS, SNS, EventBridge, AppSync, Amplify, CloudWatch, IAM, MongoDB</w:t>
+        <w:t xml:space="preserve">Frontend: TypeScript, JavaScript, React, Next.js, React Native, Vite, Electron</w:t>
+      </w:r>
+    </w:p>
+    <w:p>
+      <w:pPr>
+        <w:spacing w:after="40"/>
+      </w:pPr>
+      <w:r>
+        <w:t xml:space="preserve">Backend and APIs: Node.js, NestJS, Python (FastAPI), REST, GraphQL (AppSync), MCP tools</w:t>
+      </w:r>
+    </w:p>
+    <w:p>
+      <w:pPr>
+        <w:spacing w:after="40"/>
+      </w:pPr>
+      <w:r>
+        <w:t xml:space="preserve">Cloud and DevOps: AWS (Lambda, ECS, S3, DynamoDB, Cognito, SQS/SNS, EventBridge, AppSync, Amplify, CloudWatch, IAM, Route 53, Secrets Manager), GCP (Cloud Run, BigQuery), Docker, Terraform, CI/CD</w:t>
+      </w:r>
+    </w:p>
+    <w:p>
+      <w:pPr>
+        <w:spacing w:after="40"/>
+      </w:pPr>
+      <w:r>
+        <w:t xml:space="preserve">Databases and Data: SQL, PostgreSQL, MySQL, SQL Server, MongoDB, DynamoDB, Supabase (RLS), BigQuery, dbt</w:t>
+      </w:r>
+    </w:p>
+    <w:p>
+      <w:pPr>
+        <w:spacing w:after="40"/>
+      </w:pPr>
+      <w:r>
+        <w:t xml:space="preserve">AI and Automation: LLMs, agentic AI, RAG pipelines, multi-agent systems, Google ADK, access control (RBAC/ACL), n8n</w:t>
       </w:r>
     </w:p>
     <w:p>
@@ -331,7 +381,7 @@
         <w:spacing w:after="80"/>
       </w:pPr>
       <w:r>
-        <w:t xml:space="preserve">Familiar (learning or light use): Sentry, LaunchDarkly, Terraform</w:t>
+        <w:t xml:space="preserve">Tooling: Git, GitHub, Zod, Sentry, LaunchDarkly</w:t>
       </w:r>
     </w:p>
     <w:p>

</xml_diff>